<commit_message>
removed the extra page from the test-plan
</commit_message>
<xml_diff>
--- a/docs/Odoo_Test_Plan.docx
+++ b/docs/Odoo_Test_Plan.docx
@@ -3902,11 +3902,6 @@
         </w:rPr>
         <w:t>Additional browsers for manual spot-checks: Firefox, Microsoft Edge</w:t>
       </w:r>
-    </w:p>
-    <w:p>
-      <w:pPr>
-        <w:spacing w:after="80"/>
-      </w:pPr>
     </w:p>
     <w:p>
       <w:pPr>
@@ -5068,6 +5063,7 @@
   <w:style w:type="character" w:default="1" w:styleId="DefaultParagraphFont">
     <w:name w:val="Default Paragraph Font"/>
     <w:uiPriority w:val="1"/>
+    <w:semiHidden/>
     <w:unhideWhenUsed/>
   </w:style>
   <w:style w:type="table" w:default="1" w:styleId="TableNormal">

</xml_diff>